<commit_message>
alex updates DQR report
</commit_message>
<xml_diff>
--- a/DQR/DQR_report.docx
+++ b/DQR/DQR_report.docx
@@ -119,8 +119,6 @@
         </w:rPr>
         <w:t xml:space="preserve"> Data understanding, quality diagnosis, and action recommendations for downstream cleaning and modeling.</w:t>
       </w:r>
-      <w:bookmarkStart w:id="46" w:name="_GoBack"/>
-      <w:bookmarkEnd w:id="46"/>
     </w:p>
     <w:p>
       <w:pPr>
@@ -405,7 +403,7 @@
           <w:sz w:val="22"/>
           <w:szCs w:val="22"/>
         </w:rPr>
-        <w:t xml:space="preserve">4. </w:t>
+        <w:t xml:space="preserve"> </w:t>
       </w:r>
       <w:r>
         <w:rPr>
@@ -6118,6 +6116,7 @@
       <w:pPr>
         <w:pStyle w:val="24"/>
         <w:numPr>
+          <w:ilvl w:val="0"/>
           <w:numId w:val="0"/>
         </w:numPr>
         <w:spacing w:before="36" w:after="36"/>
@@ -6133,6 +6132,7 @@
       <w:pPr>
         <w:pStyle w:val="24"/>
         <w:numPr>
+          <w:ilvl w:val="0"/>
           <w:numId w:val="0"/>
         </w:numPr>
         <w:spacing w:before="36" w:after="36"/>
@@ -6148,6 +6148,7 @@
       <w:pPr>
         <w:pStyle w:val="24"/>
         <w:numPr>
+          <w:ilvl w:val="0"/>
           <w:numId w:val="0"/>
         </w:numPr>
         <w:spacing w:before="36" w:after="36"/>
@@ -6163,6 +6164,7 @@
       <w:pPr>
         <w:pStyle w:val="24"/>
         <w:numPr>
+          <w:ilvl w:val="0"/>
           <w:numId w:val="0"/>
         </w:numPr>
         <w:spacing w:before="36" w:after="36"/>
@@ -6178,6 +6180,7 @@
       <w:pPr>
         <w:pStyle w:val="24"/>
         <w:numPr>
+          <w:ilvl w:val="0"/>
           <w:numId w:val="0"/>
         </w:numPr>
         <w:spacing w:before="36" w:after="36"/>
@@ -6193,6 +6196,7 @@
       <w:pPr>
         <w:pStyle w:val="24"/>
         <w:numPr>
+          <w:ilvl w:val="0"/>
           <w:numId w:val="0"/>
         </w:numPr>
         <w:spacing w:before="36" w:after="36"/>
@@ -6208,6 +6212,7 @@
       <w:pPr>
         <w:pStyle w:val="24"/>
         <w:numPr>
+          <w:ilvl w:val="0"/>
           <w:numId w:val="0"/>
         </w:numPr>
         <w:spacing w:before="36" w:after="36"/>
@@ -7290,7 +7295,15 @@
         <w:rPr>
           <w:color w:val="auto"/>
         </w:rPr>
-        <w:t>Table A9: VAT Consistency Check Supplement (cell 42)</w:t>
+        <w:t>Table A9: VAT C</w:t>
+      </w:r>
+      <w:bookmarkStart w:id="46" w:name="_GoBack"/>
+      <w:bookmarkEnd w:id="46"/>
+      <w:r>
+        <w:rPr>
+          <w:color w:val="auto"/>
+        </w:rPr>
+        <w:t>onsistency Check Supplement (cell 42)</w:t>
       </w:r>
     </w:p>
     <w:p>
@@ -8044,6 +8057,11 @@
       <w:color w:val="4F81BD" w:themeColor="accent1"/>
       <w:sz w:val="32"/>
       <w:szCs w:val="32"/>
+      <w14:textFill>
+        <w14:solidFill>
+          <w14:schemeClr w14:val="accent1"/>
+        </w14:solidFill>
+      </w14:textFill>
     </w:rPr>
   </w:style>
   <w:style w:type="paragraph" w:styleId="4">
@@ -8066,6 +8084,11 @@
       <w:color w:val="4F81BD" w:themeColor="accent1"/>
       <w:sz w:val="28"/>
       <w:szCs w:val="28"/>
+      <w14:textFill>
+        <w14:solidFill>
+          <w14:schemeClr w14:val="accent1"/>
+        </w14:solidFill>
+      </w14:textFill>
     </w:rPr>
   </w:style>
   <w:style w:type="paragraph" w:styleId="5">
@@ -8088,6 +8111,11 @@
       <w:color w:val="4F81BD" w:themeColor="accent1"/>
       <w:sz w:val="24"/>
       <w:szCs w:val="24"/>
+      <w14:textFill>
+        <w14:solidFill>
+          <w14:schemeClr w14:val="accent1"/>
+        </w14:solidFill>
+      </w14:textFill>
     </w:rPr>
   </w:style>
   <w:style w:type="paragraph" w:styleId="6">
@@ -8110,6 +8138,11 @@
       <w:color w:val="4F81BD" w:themeColor="accent1"/>
       <w:sz w:val="24"/>
       <w:szCs w:val="24"/>
+      <w14:textFill>
+        <w14:solidFill>
+          <w14:schemeClr w14:val="accent1"/>
+        </w14:solidFill>
+      </w14:textFill>
     </w:rPr>
   </w:style>
   <w:style w:type="paragraph" w:styleId="7">
@@ -8131,6 +8164,11 @@
       <w:color w:val="4F81BD" w:themeColor="accent1"/>
       <w:sz w:val="24"/>
       <w:szCs w:val="24"/>
+      <w14:textFill>
+        <w14:solidFill>
+          <w14:schemeClr w14:val="accent1"/>
+        </w14:solidFill>
+      </w14:textFill>
     </w:rPr>
   </w:style>
   <w:style w:type="paragraph" w:styleId="8">
@@ -8151,6 +8189,11 @@
       <w:color w:val="4F81BD" w:themeColor="accent1"/>
       <w:sz w:val="24"/>
       <w:szCs w:val="24"/>
+      <w14:textFill>
+        <w14:solidFill>
+          <w14:schemeClr w14:val="accent1"/>
+        </w14:solidFill>
+      </w14:textFill>
     </w:rPr>
   </w:style>
   <w:style w:type="paragraph" w:styleId="9">
@@ -8171,6 +8214,11 @@
       <w:color w:val="4F81BD" w:themeColor="accent1"/>
       <w:sz w:val="24"/>
       <w:szCs w:val="24"/>
+      <w14:textFill>
+        <w14:solidFill>
+          <w14:schemeClr w14:val="accent1"/>
+        </w14:solidFill>
+      </w14:textFill>
     </w:rPr>
   </w:style>
   <w:style w:type="paragraph" w:styleId="10">
@@ -8191,6 +8239,11 @@
       <w:color w:val="4F81BD" w:themeColor="accent1"/>
       <w:sz w:val="24"/>
       <w:szCs w:val="24"/>
+      <w14:textFill>
+        <w14:solidFill>
+          <w14:schemeClr w14:val="accent1"/>
+        </w14:solidFill>
+      </w14:textFill>
     </w:rPr>
   </w:style>
   <w:style w:type="paragraph" w:styleId="11">
@@ -8211,6 +8264,11 @@
       <w:color w:val="4F81BD" w:themeColor="accent1"/>
       <w:sz w:val="24"/>
       <w:szCs w:val="24"/>
+      <w14:textFill>
+        <w14:solidFill>
+          <w14:schemeClr w14:val="accent1"/>
+        </w14:solidFill>
+      </w14:textFill>
     </w:rPr>
   </w:style>
   <w:style w:type="character" w:default="1" w:styleId="19">
@@ -8315,7 +8373,7 @@
       <w:rFonts w:asciiTheme="majorHAnsi" w:hAnsiTheme="majorHAnsi" w:eastAsiaTheme="majorEastAsia" w:cstheme="majorBidi"/>
       <w:b/>
       <w:bCs/>
-      <w:color w:val="335B8A" w:themeColor="accent1" w:themeShade="B5"/>
+      <w:color w:val="345B8A" w:themeColor="accent1" w:themeShade="B5"/>
       <w:sz w:val="36"/>
       <w:szCs w:val="36"/>
     </w:rPr>
@@ -8333,6 +8391,11 @@
     <w:uiPriority w:val="0"/>
     <w:rPr>
       <w:color w:val="4F81BD" w:themeColor="accent1"/>
+      <w14:textFill>
+        <w14:solidFill>
+          <w14:schemeClr w14:val="accent1"/>
+        </w14:solidFill>
+      </w14:textFill>
     </w:rPr>
   </w:style>
   <w:style w:type="character" w:customStyle="1" w:styleId="21">
@@ -8420,7 +8483,6 @@
       </w:tblCellMar>
     </w:tblPr>
     <w:tblStylePr w:type="firstRow">
-      <w:tblPr/>
       <w:tcPr>
         <w:tcBorders>
           <w:bottom w:val="single" w:color="auto" w:sz="0" w:space="0"/>
@@ -8513,7 +8575,7 @@
       <w:rFonts w:asciiTheme="majorHAnsi" w:hAnsiTheme="majorHAnsi" w:eastAsiaTheme="majorEastAsia" w:cstheme="majorBidi"/>
       <w:b w:val="0"/>
       <w:bCs w:val="0"/>
-      <w:color w:val="366091" w:themeColor="accent1" w:themeShade="BF"/>
+      <w:color w:val="376092" w:themeColor="accent1" w:themeShade="BF"/>
     </w:rPr>
   </w:style>
   <w:style w:type="character" w:customStyle="1" w:styleId="39">

</xml_diff>